<commit_message>
docs: agregar anexos de capturas pa3
</commit_message>
<xml_diff>
--- a/docs/informe-tecnico-pa3.docx
+++ b/docs/informe-tecnico-pa3.docx
@@ -1142,6 +1142,326 @@
         <w:pStyle w:val="Heading1"/>
       </w:pPr>
       <w:r>
+        <w:t xml:space="preserve">Evidencias fotograficas sugeridas segun rubrica</w:t>
+      </w:r>
+    </w:p>
+    <w:p>
+      <w:r>
+        <w:t xml:space="preserve"/>
+      </w:r>
+    </w:p>
+    <w:p>
+      <w:r>
+        <w:t xml:space="preserve">Para fortalecer la evaluacion en nivel sobresaliente, se recomienda adjuntar capturas de pantalla del codigo, del sistema en ejecucion y del repositorio GitHub. Cada captura debe incluir un titulo breve y una descripcion que explique que criterio de la rubrica evidencia.</w:t>
+      </w:r>
+    </w:p>
+    <w:p>
+      <w:r>
+        <w:t xml:space="preserve"/>
+      </w:r>
+    </w:p>
+    <w:p>
+      <w:pPr>
+        <w:pStyle w:val="Heading2"/>
+      </w:pPr>
+      <w:r>
+        <w:t xml:space="preserve">Evidencia 1: Estructura del proyecto</w:t>
+      </w:r>
+    </w:p>
+    <w:p>
+      <w:r>
+        <w:t xml:space="preserve"/>
+      </w:r>
+    </w:p>
+    <w:p>
+      <w:r>
+        <w:t xml:space="preserve">Captura sugerida: explorador de archivos o VS Code mostrando las carpetas app/Services, tests/Unit, tests/Feature/Orm, docs y .github/workflows.</w:t>
+      </w:r>
+    </w:p>
+    <w:p>
+      <w:r>
+        <w:t xml:space="preserve"/>
+      </w:r>
+    </w:p>
+    <w:p>
+      <w:r>
+        <w:t xml:space="preserve">Descripcion para el informe: esta captura evidencia la organizacion del proyecto, la ubicacion de pruebas unitarias, pruebas ORM, documentacion tecnica y configuracion de integracion continua.</w:t>
+      </w:r>
+    </w:p>
+    <w:p>
+      <w:r>
+        <w:t xml:space="preserve"/>
+      </w:r>
+    </w:p>
+    <w:p>
+      <w:pPr>
+        <w:pStyle w:val="Heading2"/>
+      </w:pPr>
+      <w:r>
+        <w:t xml:space="preserve">Evidencia 2: Codigo de la Kata TDD</w:t>
+      </w:r>
+    </w:p>
+    <w:p>
+      <w:r>
+        <w:t xml:space="preserve"/>
+      </w:r>
+    </w:p>
+    <w:p>
+      <w:r>
+        <w:t xml:space="preserve">Captura sugerida: archivo app/Services/VentaTotalCalculator.php, mostrando el metodo calcular(), las validaciones de datos invalidos, el calculo de subtotal, descuento, IGV y total.</w:t>
+      </w:r>
+    </w:p>
+    <w:p>
+      <w:r>
+        <w:t xml:space="preserve"/>
+      </w:r>
+    </w:p>
+    <w:p>
+      <w:r>
+        <w:t xml:space="preserve">Descripcion para el informe: esta captura evidencia la solucion de la Kata TDD relacionada con el calculo del total de venta farmaceutica con IGV.</w:t>
+      </w:r>
+    </w:p>
+    <w:p>
+      <w:r>
+        <w:t xml:space="preserve"/>
+      </w:r>
+    </w:p>
+    <w:p>
+      <w:pPr>
+        <w:pStyle w:val="Heading2"/>
+      </w:pPr>
+      <w:r>
+        <w:t xml:space="preserve">Evidencia 3: Pruebas unitarias de la Kata</w:t>
+      </w:r>
+    </w:p>
+    <w:p>
+      <w:r>
+        <w:t xml:space="preserve"/>
+      </w:r>
+    </w:p>
+    <w:p>
+      <w:r>
+        <w:t xml:space="preserve">Captura sugerida: archivo tests/Unit/VentaTotalCalculatorTest.php, mostrando pruebas de venta gravada, descuento, productos exonerados, productos inafectos y casos invalidos.</w:t>
+      </w:r>
+    </w:p>
+    <w:p>
+      <w:r>
+        <w:t xml:space="preserve"/>
+      </w:r>
+    </w:p>
+    <w:p>
+      <w:r>
+        <w:t xml:space="preserve">Descripcion para el informe: esta captura evidencia el diseno e implementacion de pruebas unitarias con multiples escenarios, incluyendo casos correctos, casos limite y errores.</w:t>
+      </w:r>
+    </w:p>
+    <w:p>
+      <w:r>
+        <w:t xml:space="preserve"/>
+      </w:r>
+    </w:p>
+    <w:p>
+      <w:pPr>
+        <w:pStyle w:val="Heading2"/>
+      </w:pPr>
+      <w:r>
+        <w:t xml:space="preserve">Evidencia 4: Pruebas ORM con Eloquent</w:t>
+      </w:r>
+    </w:p>
+    <w:p>
+      <w:r>
+        <w:t xml:space="preserve"/>
+      </w:r>
+    </w:p>
+    <w:p>
+      <w:r>
+        <w:t xml:space="preserve">Captura sugerida: archivo tests/Feature/Orm/FarmaGoOrmTest.php, mostrando pruebas de creacion, lectura, actualizacion, eliminacion logica, relaciones y consultas con with().</w:t>
+      </w:r>
+    </w:p>
+    <w:p>
+      <w:r>
+        <w:t xml:space="preserve"/>
+      </w:r>
+    </w:p>
+    <w:p>
+      <w:r>
+        <w:t xml:space="preserve">Descripcion para el informe: esta captura evidencia el uso correcto de Eloquent ORM, relaciones entre modelos y consultas optimizadas mediante eager loading.</w:t>
+      </w:r>
+    </w:p>
+    <w:p>
+      <w:r>
+        <w:t xml:space="preserve"/>
+      </w:r>
+    </w:p>
+    <w:p>
+      <w:pPr>
+        <w:pStyle w:val="Heading2"/>
+      </w:pPr>
+      <w:r>
+        <w:t xml:space="preserve">Evidencia 5: Ciclo Red-Green-Refactor documentado</w:t>
+      </w:r>
+    </w:p>
+    <w:p>
+      <w:r>
+        <w:t xml:space="preserve"/>
+      </w:r>
+    </w:p>
+    <w:p>
+      <w:r>
+        <w:t xml:space="preserve">Captura sugerida: archivo docs/tdd-red-green-refactor.md, mostrando la tabla de iteraciones con columnas Red, Green y Refactor.</w:t>
+      </w:r>
+    </w:p>
+    <w:p>
+      <w:r>
+        <w:t xml:space="preserve"/>
+      </w:r>
+    </w:p>
+    <w:p>
+      <w:r>
+        <w:t xml:space="preserve">Descripcion para el informe: esta captura evidencia que el desarrollo siguio el ciclo TDD completo y que las iteraciones fueron documentadas.</w:t>
+      </w:r>
+    </w:p>
+    <w:p>
+      <w:r>
+        <w:t xml:space="preserve"/>
+      </w:r>
+    </w:p>
+    <w:p>
+      <w:pPr>
+        <w:pStyle w:val="Heading2"/>
+      </w:pPr>
+      <w:r>
+        <w:t xml:space="preserve">Evidencia 6: Ejecucion exitosa de pruebas</w:t>
+      </w:r>
+    </w:p>
+    <w:p>
+      <w:r>
+        <w:t xml:space="preserve"/>
+      </w:r>
+    </w:p>
+    <w:p>
+      <w:r>
+        <w:t xml:space="preserve">Captura sugerida: terminal ejecutando php artisan test, mostrando el resultado Tests: 41 passed (114 assertions).</w:t>
+      </w:r>
+    </w:p>
+    <w:p>
+      <w:r>
+        <w:t xml:space="preserve"/>
+      </w:r>
+    </w:p>
+    <w:p>
+      <w:r>
+        <w:t xml:space="preserve">Descripcion para el informe: esta captura evidencia que las pruebas automatizadas se ejecutan correctamente y validan el comportamiento del sistema.</w:t>
+      </w:r>
+    </w:p>
+    <w:p>
+      <w:r>
+        <w:t xml:space="preserve"/>
+      </w:r>
+    </w:p>
+    <w:p>
+      <w:pPr>
+        <w:pStyle w:val="Heading2"/>
+      </w:pPr>
+      <w:r>
+        <w:t xml:space="preserve">Evidencia 7: Sistema FarmaGo en ejecucion</w:t>
+      </w:r>
+    </w:p>
+    <w:p>
+      <w:r>
+        <w:t xml:space="preserve"/>
+      </w:r>
+    </w:p>
+    <w:p>
+      <w:r>
+        <w:t xml:space="preserve">Captura sugerida: navegador abierto en http://127.0.0.1:8000 o http://127.0.0.1:8000/login.</w:t>
+      </w:r>
+    </w:p>
+    <w:p>
+      <w:r>
+        <w:t xml:space="preserve"/>
+      </w:r>
+    </w:p>
+    <w:p>
+      <w:r>
+        <w:t xml:space="preserve">Descripcion para el informe: esta captura evidencia que el sistema FarmaGo se ejecuta localmente y esta disponible para el usuario.</w:t>
+      </w:r>
+    </w:p>
+    <w:p>
+      <w:r>
+        <w:t xml:space="preserve"/>
+      </w:r>
+    </w:p>
+    <w:p>
+      <w:pPr>
+        <w:pStyle w:val="Heading2"/>
+      </w:pPr>
+      <w:r>
+        <w:t xml:space="preserve">Evidencia 8: Repositorio GitHub</w:t>
+      </w:r>
+    </w:p>
+    <w:p>
+      <w:r>
+        <w:t xml:space="preserve"/>
+      </w:r>
+    </w:p>
+    <w:p>
+      <w:r>
+        <w:t xml:space="preserve">Captura sugerida: pagina principal del repositorio https://github.com/kobbryant2014-stack/FarmaGo.</w:t>
+      </w:r>
+    </w:p>
+    <w:p>
+      <w:r>
+        <w:t xml:space="preserve"/>
+      </w:r>
+    </w:p>
+    <w:p>
+      <w:r>
+        <w:t xml:space="preserve">Descripcion para el informe: esta captura evidencia que el codigo fuente fue subido a GitHub y gestionado mediante control de versiones.</w:t>
+      </w:r>
+    </w:p>
+    <w:p>
+      <w:r>
+        <w:t xml:space="preserve"/>
+      </w:r>
+    </w:p>
+    <w:p>
+      <w:pPr>
+        <w:pStyle w:val="Heading2"/>
+      </w:pPr>
+      <w:r>
+        <w:t xml:space="preserve">Evidencia 9: GitHub Actions</w:t>
+      </w:r>
+    </w:p>
+    <w:p>
+      <w:r>
+        <w:t xml:space="preserve"/>
+      </w:r>
+    </w:p>
+    <w:p>
+      <w:r>
+        <w:t xml:space="preserve">Captura sugerida: archivo .github/workflows/tests.yml o pestana Actions del repositorio mostrando ejecucion del workflow.</w:t>
+      </w:r>
+    </w:p>
+    <w:p>
+      <w:r>
+        <w:t xml:space="preserve"/>
+      </w:r>
+    </w:p>
+    <w:p>
+      <w:r>
+        <w:t xml:space="preserve">Descripcion para el informe: esta captura evidencia la integracion de pruebas automatizadas en el flujo agil mediante integracion continua.</w:t>
+      </w:r>
+    </w:p>
+    <w:p>
+      <w:r>
+        <w:t xml:space="preserve"/>
+      </w:r>
+    </w:p>
+    <w:p>
+      <w:pPr>
+        <w:pStyle w:val="Heading1"/>
+      </w:pPr>
+      <w:r>
         <w:t xml:space="preserve">Resultados obtenidos</w:t>
       </w:r>
     </w:p>
@@ -1580,6 +1900,154 @@
     <w:p>
       <w:r>
         <w:t xml:space="preserve">Enlace del repositorio GitHub: ______________________________</w:t>
+      </w:r>
+    </w:p>
+    <w:p>
+      <w:r>
+        <w:t xml:space="preserve"/>
+      </w:r>
+    </w:p>
+    <w:p>
+      <w:pPr>
+        <w:pStyle w:val="Heading1"/>
+      </w:pPr>
+      <w:r>
+        <w:t xml:space="preserve">Anexos fotograficos para completar en Word</w:t>
+      </w:r>
+    </w:p>
+    <w:p>
+      <w:r>
+        <w:t xml:space="preserve"/>
+      </w:r>
+    </w:p>
+    <w:p>
+      <w:r>
+        <w:t xml:space="preserve">Anexo 1: Estructura del proyecto FarmaGo.</w:t>
+      </w:r>
+    </w:p>
+    <w:p>
+      <w:r>
+        <w:t xml:space="preserve">[Pegar captura aqui]</w:t>
+      </w:r>
+    </w:p>
+    <w:p>
+      <w:r>
+        <w:t xml:space="preserve"/>
+      </w:r>
+    </w:p>
+    <w:p>
+      <w:r>
+        <w:t xml:space="preserve">Anexo 2: Codigo de la Kata TDD VentaTotalCalculator.</w:t>
+      </w:r>
+    </w:p>
+    <w:p>
+      <w:r>
+        <w:t xml:space="preserve">[Pegar captura aqui]</w:t>
+      </w:r>
+    </w:p>
+    <w:p>
+      <w:r>
+        <w:t xml:space="preserve"/>
+      </w:r>
+    </w:p>
+    <w:p>
+      <w:r>
+        <w:t xml:space="preserve">Anexo 3: Pruebas unitarias de la Kata TDD.</w:t>
+      </w:r>
+    </w:p>
+    <w:p>
+      <w:r>
+        <w:t xml:space="preserve">[Pegar captura aqui]</w:t>
+      </w:r>
+    </w:p>
+    <w:p>
+      <w:r>
+        <w:t xml:space="preserve"/>
+      </w:r>
+    </w:p>
+    <w:p>
+      <w:r>
+        <w:t xml:space="preserve">Anexo 4: Pruebas ORM con Eloquent.</w:t>
+      </w:r>
+    </w:p>
+    <w:p>
+      <w:r>
+        <w:t xml:space="preserve">[Pegar captura aqui]</w:t>
+      </w:r>
+    </w:p>
+    <w:p>
+      <w:r>
+        <w:t xml:space="preserve"/>
+      </w:r>
+    </w:p>
+    <w:p>
+      <w:r>
+        <w:t xml:space="preserve">Anexo 5: Tabla de iteraciones Red-Green-Refactor.</w:t>
+      </w:r>
+    </w:p>
+    <w:p>
+      <w:r>
+        <w:t xml:space="preserve">[Pegar captura aqui]</w:t>
+      </w:r>
+    </w:p>
+    <w:p>
+      <w:r>
+        <w:t xml:space="preserve"/>
+      </w:r>
+    </w:p>
+    <w:p>
+      <w:r>
+        <w:t xml:space="preserve">Anexo 6: Ejecucion exitosa de php artisan test.</w:t>
+      </w:r>
+    </w:p>
+    <w:p>
+      <w:r>
+        <w:t xml:space="preserve">[Pegar captura aqui]</w:t>
+      </w:r>
+    </w:p>
+    <w:p>
+      <w:r>
+        <w:t xml:space="preserve"/>
+      </w:r>
+    </w:p>
+    <w:p>
+      <w:r>
+        <w:t xml:space="preserve">Anexo 7: Sistema FarmaGo ejecutandose en navegador.</w:t>
+      </w:r>
+    </w:p>
+    <w:p>
+      <w:r>
+        <w:t xml:space="preserve">[Pegar captura aqui]</w:t>
+      </w:r>
+    </w:p>
+    <w:p>
+      <w:r>
+        <w:t xml:space="preserve"/>
+      </w:r>
+    </w:p>
+    <w:p>
+      <w:r>
+        <w:t xml:space="preserve">Anexo 8: Repositorio GitHub del proyecto.</w:t>
+      </w:r>
+    </w:p>
+    <w:p>
+      <w:r>
+        <w:t xml:space="preserve">[Pegar captura aqui]</w:t>
+      </w:r>
+    </w:p>
+    <w:p>
+      <w:r>
+        <w:t xml:space="preserve"/>
+      </w:r>
+    </w:p>
+    <w:p>
+      <w:r>
+        <w:t xml:space="preserve">Anexo 9: GitHub Actions o workflow de pruebas.</w:t>
+      </w:r>
+    </w:p>
+    <w:p>
+      <w:r>
+        <w:t xml:space="preserve">[Pegar captura aqui]</w:t>
       </w:r>
     </w:p>
     <w:sectPr>

</xml_diff>